<commit_message>
KIRISH qismi yangilandi - 25 ta ssilka (izoh) qo'shildi
</commit_message>
<xml_diff>
--- a/KIRISH_QISMI.docx
+++ b/KIRISH_QISMI.docx
@@ -47,7 +47,22 @@
           <w:rFonts w:ascii="Times New Roman" w:hAnsi="Times New Roman"/>
           <w:sz w:val="28"/>
         </w:rPr>
-        <w:t>Zamonaviy dunyo sog'liqni saqlash tizimlarida boshqaruv samaradorligini oshirish masalasi global miqyosda eng dolzarb muammolardan biriga aylangan. Jahon sog'liqni saqlash tashkiloti (JSST) ma'lumotlariga ko'ra, dunyo miqyosida sog'liqni saqlash sohasiga ajratilayotgan mablag'larning har yili 20–40 foizigacha bo'lgan qismi samarasiz sarflanmoqda, bu esa boshqaruv mexanizmlarini optimallashtirish zarurligini bevosita ko'rsatadi. Sog'liqni saqlash muassasalari faoliyati samaradorligi ko'p jihatdan boshqaruv qarorlarining qanchalik tezkor va aniq ijrochilarga yetib borishiga bog'liq bo'lib, tashkiliy boshqaruv mexanizmlarini ilmiy asosda takomillashtirish bugungi kunning eng muhim vazifalaridan hisoblanadi.</w:t>
+        <w:t>Zamonaviy dunyo sog'liqni saqlash tizimlarida boshqaruv samaradorligini oshirish masalasi global miqyosda eng dolzarb muammolardan biriga aylangan. Jahon sog'liqni saqlash tashkiloti (JSST) ma'lumotlariga ko'ra, dunyo miqyosida sog'liqni saqlash sohasiga ajratilayotgan mablag'larning har yili 20–40 foizigacha bo'lgan qismi samarasiz sarflanmoqda</w:t>
+      </w:r>
+      <w:r>
+        <w:rPr>
+          <w:rFonts w:ascii="Times New Roman" w:hAnsi="Times New Roman"/>
+          <w:sz w:val="28"/>
+          <w:vertAlign w:val="superscript"/>
+        </w:rPr>
+        <w:t>1</w:t>
+      </w:r>
+      <w:r>
+        <w:rPr>
+          <w:rFonts w:ascii="Times New Roman" w:hAnsi="Times New Roman"/>
+          <w:sz w:val="28"/>
+        </w:rPr>
+        <w:t>, bu esa boshqaruv mexanizmlarini optimallashtirish zarurligini bevosita ko'rsatadi. Sog'liqni saqlash muassasalari faoliyati samaradorligi ko'p jihatdan boshqaruv qarorlarining qanchalik tezkor va aniq ijrochilarga yetib borishiga bog'liq bo'lib, tashkiliy boshqaruv mexanizmlarini ilmiy asosda takomillashtirish bugungi kunning eng muhim vazifalaridan hisoblanadi.</w:t>
       </w:r>
     </w:p>
     <w:p>
@@ -75,6 +90,35 @@
           <w:rFonts w:ascii="Times New Roman" w:hAnsi="Times New Roman"/>
           <w:sz w:val="28"/>
         </w:rPr>
+        <w:t>Texnologik rivojlanish, xususan katta ma'lumotlar va sun'iy intellektning sog'liqni saqlash tizimiga joriy etilishi diagnostika, davolash va boshqaruv jarayonlarini sezilarli darajada yaxshilash imkonini bersa-da, ma'lumotlar maxfiyligi, tizimlar o'rtasida integratsiya, axloqiy va huquqiy muammolar, infratuzilma va moliyalashtirish yetishmovchiligi, shuningdek, malakali kadrlar va resurslar taqchilligi kabi omillar tufayli ushbu texnologiyalarni samarali joriy etish va aholining tibbiy xizmatlardan teng foydalanishini ta'minlash hali ham murakkab global muammo bo'lib qolmoqda</w:t>
+      </w:r>
+      <w:r>
+        <w:rPr>
+          <w:rFonts w:ascii="Times New Roman" w:hAnsi="Times New Roman"/>
+          <w:sz w:val="28"/>
+          <w:vertAlign w:val="superscript"/>
+        </w:rPr>
+        <w:t>2</w:t>
+      </w:r>
+      <w:r>
+        <w:rPr>
+          <w:rFonts w:ascii="Times New Roman" w:hAnsi="Times New Roman"/>
+          <w:sz w:val="28"/>
+        </w:rPr>
+        <w:t>.</w:t>
+      </w:r>
+    </w:p>
+    <w:p>
+      <w:pPr>
+        <w:spacing w:line="360" w:lineRule="auto"/>
+        <w:ind w:firstLine="709"/>
+        <w:jc w:val="both"/>
+      </w:pPr>
+      <w:r>
+        <w:rPr>
+          <w:rFonts w:ascii="Times New Roman" w:hAnsi="Times New Roman"/>
+          <w:sz w:val="28"/>
+        </w:rPr>
         <w:t>O'zbekiston Respublikasida sog'liqni saqlash tizimini tubdan isloh qilish bo'yicha keng ko'lamli chora-tadbirlar amalga oshirilmoqda. Xususan, sobiq sovet davridan meros bo'lib qolgan markazlashgan Semashko modelidan bemor ehtiyojlariga yo'naltirilgan zamonaviy sog'liqni saqlash tizimiga o'tish resurslarni taqsimlash va tibbiyot muassasalari faoliyati natijadorligini baholashning mutlaqo yangi yondashuvlarini talab etmoqda. Davlat byudjeti mablag'larining cheklanganligi hamda 2030-yilgacha sog'liqni saqlash xizmatlari bilan umumiy qamrovni (Universal Health Coverage – UHC) ta'minlash maqsadlariga erishish zarurati sharoitida an'anaviy ma'muriy-buyruqbozlik boshqaruv usullari o'rnini bozor mexanizmlari egallamoqda.</w:t>
       </w:r>
     </w:p>
@@ -89,7 +133,82 @@
           <w:rFonts w:ascii="Times New Roman" w:hAnsi="Times New Roman"/>
           <w:sz w:val="28"/>
         </w:rPr>
-        <w:t>O'zbekiston Respublikasi Prezidentining 2018 yil 7 dekabrdagi "O'zbekiston Respublikasi sog'liqni saqlash tizimini tubdan takomillashtirish bo'yicha kompleks chora-tadbirlar to'g'risida"gi PF-5590-sonli Farmoni, 2017-yil 1-apreldagi "Sog'liqni saqlash sohasida xususiy sektorni yanada rivojlantirish chora-tadbirlari to'g'risida"gi PQ-2863-sonli Qarori, 2023-yil 6-sentabrdagi "Sog'liqni saqlash vazirligi faoliyatini yanada takomillashtirish chora-tadbirlari to'g'risida"gi PF-156-sonli Qarori, 2025 yil 19 maydagi "Sog'liqni saqlash tizimidagi islohotlarni amalga oshirishning qo'shimcha chora-tadbirlari to'g'risida"gi PQ-185-sonli Qarori hamda mazkur sohaga tegishli boshqa me'yoriy-huquqiy hujjatlarda sog'liqni saqlash tizimini rivojlantirish strategiyasining istiqbolli yo'nalishlari belgilab berilgan. Ushbu me'yoriy-huquqiy hujjatlarda belgilangan vazifalarni amalga oshirishda mazkur dissertatsiya tadqiqoti muayyan darajada xizmat qiladi.</w:t>
+        <w:t>O'zbekiston Respublikasi Prezidentining 2018 yil 7 dekabrdagi "O'zbekiston Respublikasi sog'liqni saqlash tizimini tubdan takomillashtirish bo'yicha kompleks chora-tadbirlar to'g'risida"gi PF-5590-sonli Farmoni</w:t>
+      </w:r>
+      <w:r>
+        <w:rPr>
+          <w:rFonts w:ascii="Times New Roman" w:hAnsi="Times New Roman"/>
+          <w:sz w:val="28"/>
+          <w:vertAlign w:val="superscript"/>
+        </w:rPr>
+        <w:t>3</w:t>
+      </w:r>
+      <w:r>
+        <w:rPr>
+          <w:rFonts w:ascii="Times New Roman" w:hAnsi="Times New Roman"/>
+          <w:sz w:val="28"/>
+        </w:rPr>
+        <w:t>, 2019 yil 13 fevraldagi "2019–2025-yillarda O'zbekiston Respublikasi aholisining ruhiy salomatligini muhofaza qilish xizmatini rivojlantirish konsepsiyasini tasdiqlash to'g'risida"gi PQ-4190-sonli Qarori</w:t>
+      </w:r>
+      <w:r>
+        <w:rPr>
+          <w:rFonts w:ascii="Times New Roman" w:hAnsi="Times New Roman"/>
+          <w:sz w:val="28"/>
+          <w:vertAlign w:val="superscript"/>
+        </w:rPr>
+        <w:t>4</w:t>
+      </w:r>
+      <w:r>
+        <w:rPr>
+          <w:rFonts w:ascii="Times New Roman" w:hAnsi="Times New Roman"/>
+          <w:sz w:val="28"/>
+        </w:rPr>
+        <w:t>, 2023-yil 6-sentabrdagi "Sog'liqni saqlash vazirligi faoliyatini yanada takomillashtirish chora-tadbirlari to'g'risida"gi PF-156-sonli Qarori</w:t>
+      </w:r>
+      <w:r>
+        <w:rPr>
+          <w:rFonts w:ascii="Times New Roman" w:hAnsi="Times New Roman"/>
+          <w:sz w:val="28"/>
+          <w:vertAlign w:val="superscript"/>
+        </w:rPr>
+        <w:t>5</w:t>
+      </w:r>
+      <w:r>
+        <w:rPr>
+          <w:rFonts w:ascii="Times New Roman" w:hAnsi="Times New Roman"/>
+          <w:sz w:val="28"/>
+        </w:rPr>
+        <w:t>, 2025 yil 19 maydagi "Sog'liqni saqlash tizimidagi islohotlarni amalga oshirishning qo'shimcha chora-tadbirlari to'g'risida"gi PQ-185-sonli Qarori</w:t>
+      </w:r>
+      <w:r>
+        <w:rPr>
+          <w:rFonts w:ascii="Times New Roman" w:hAnsi="Times New Roman"/>
+          <w:sz w:val="28"/>
+          <w:vertAlign w:val="superscript"/>
+        </w:rPr>
+        <w:t>6</w:t>
+      </w:r>
+      <w:r>
+        <w:rPr>
+          <w:rFonts w:ascii="Times New Roman" w:hAnsi="Times New Roman"/>
+          <w:sz w:val="28"/>
+        </w:rPr>
+        <w:t xml:space="preserve"> hamda O'zbekiston Respublikasi Sog'liqni saqlash vazirining 2026-yil 19-yanvardagi 3758-son buyrug'i</w:t>
+      </w:r>
+      <w:r>
+        <w:rPr>
+          <w:rFonts w:ascii="Times New Roman" w:hAnsi="Times New Roman"/>
+          <w:sz w:val="28"/>
+          <w:vertAlign w:val="superscript"/>
+        </w:rPr>
+        <w:t>7</w:t>
+      </w:r>
+      <w:r>
+        <w:rPr>
+          <w:rFonts w:ascii="Times New Roman" w:hAnsi="Times New Roman"/>
+          <w:sz w:val="28"/>
+        </w:rPr>
+        <w:t xml:space="preserve"> va mazkur sohaga tegishli boshqa me'yoriy-huquqiy hujjatlarda sog'liqni saqlash tizimini rivojlantirish strategiyasining istiqbolli yo'nalishlari belgilab berilgan. Ushbu me'yoriy-huquqiy hujjatlarda belgilangan vazifalarni amalga oshirishda mazkur dissertatsiya tadqiqoti muayyan darajada xizmat qiladi.</w:t>
       </w:r>
     </w:p>
     <w:p>
@@ -133,7 +252,127 @@
           <w:rFonts w:ascii="Times New Roman" w:hAnsi="Times New Roman"/>
           <w:sz w:val="28"/>
         </w:rPr>
-        <w:t>Sog'liqni saqlash tizimida boshqaruv nazariyasi va amaliyotining ilmiy-metodologik asoslari xorijlik olimlar, jumladan, P.Druker, A.Fayol, F.Taylor, E.Mayo, M.Meskon, V.A.Medik, V.K.Yuryev, S.A.Stolyarov, Yu.P.Lisitsin, V.Yu.Cherneskiy, P.A.Klimova, A.V.Reshetnikov, V.M.Alekseyeva, E.B.Galkin, E.Yu.Terexova, L.I.Vasiltsova va boshqalar tomonidan tadqiq qilingan.</w:t>
+        <w:t>Sog'liqni saqlash tizimida boshqaruv nazariyasi va amaliyotining ilmiy-metodologik asoslari xorijlik olimlar, jumladan, P.Druker</w:t>
+      </w:r>
+      <w:r>
+        <w:rPr>
+          <w:rFonts w:ascii="Times New Roman" w:hAnsi="Times New Roman"/>
+          <w:sz w:val="28"/>
+          <w:vertAlign w:val="superscript"/>
+        </w:rPr>
+        <w:t>8</w:t>
+      </w:r>
+      <w:r>
+        <w:rPr>
+          <w:rFonts w:ascii="Times New Roman" w:hAnsi="Times New Roman"/>
+          <w:sz w:val="28"/>
+        </w:rPr>
+        <w:t>, A.Fayol</w:t>
+      </w:r>
+      <w:r>
+        <w:rPr>
+          <w:rFonts w:ascii="Times New Roman" w:hAnsi="Times New Roman"/>
+          <w:sz w:val="28"/>
+          <w:vertAlign w:val="superscript"/>
+        </w:rPr>
+        <w:t>9</w:t>
+      </w:r>
+      <w:r>
+        <w:rPr>
+          <w:rFonts w:ascii="Times New Roman" w:hAnsi="Times New Roman"/>
+          <w:sz w:val="28"/>
+        </w:rPr>
+        <w:t>, F.Taylor</w:t>
+      </w:r>
+      <w:r>
+        <w:rPr>
+          <w:rFonts w:ascii="Times New Roman" w:hAnsi="Times New Roman"/>
+          <w:sz w:val="28"/>
+          <w:vertAlign w:val="superscript"/>
+        </w:rPr>
+        <w:t>10</w:t>
+      </w:r>
+      <w:r>
+        <w:rPr>
+          <w:rFonts w:ascii="Times New Roman" w:hAnsi="Times New Roman"/>
+          <w:sz w:val="28"/>
+        </w:rPr>
+        <w:t>, E.Mayo</w:t>
+      </w:r>
+      <w:r>
+        <w:rPr>
+          <w:rFonts w:ascii="Times New Roman" w:hAnsi="Times New Roman"/>
+          <w:sz w:val="28"/>
+          <w:vertAlign w:val="superscript"/>
+        </w:rPr>
+        <w:t>11</w:t>
+      </w:r>
+      <w:r>
+        <w:rPr>
+          <w:rFonts w:ascii="Times New Roman" w:hAnsi="Times New Roman"/>
+          <w:sz w:val="28"/>
+        </w:rPr>
+        <w:t>, M.Meskon, V.A.Medik, V.K.Yuryev</w:t>
+      </w:r>
+      <w:r>
+        <w:rPr>
+          <w:rFonts w:ascii="Times New Roman" w:hAnsi="Times New Roman"/>
+          <w:sz w:val="28"/>
+          <w:vertAlign w:val="superscript"/>
+        </w:rPr>
+        <w:t>12</w:t>
+      </w:r>
+      <w:r>
+        <w:rPr>
+          <w:rFonts w:ascii="Times New Roman" w:hAnsi="Times New Roman"/>
+          <w:sz w:val="28"/>
+        </w:rPr>
+        <w:t>, S.A.Stolyarov</w:t>
+      </w:r>
+      <w:r>
+        <w:rPr>
+          <w:rFonts w:ascii="Times New Roman" w:hAnsi="Times New Roman"/>
+          <w:sz w:val="28"/>
+          <w:vertAlign w:val="superscript"/>
+        </w:rPr>
+        <w:t>13</w:t>
+      </w:r>
+      <w:r>
+        <w:rPr>
+          <w:rFonts w:ascii="Times New Roman" w:hAnsi="Times New Roman"/>
+          <w:sz w:val="28"/>
+        </w:rPr>
+        <w:t>, Yu.P.Lisitsin</w:t>
+      </w:r>
+      <w:r>
+        <w:rPr>
+          <w:rFonts w:ascii="Times New Roman" w:hAnsi="Times New Roman"/>
+          <w:sz w:val="28"/>
+          <w:vertAlign w:val="superscript"/>
+        </w:rPr>
+        <w:t>14</w:t>
+      </w:r>
+      <w:r>
+        <w:rPr>
+          <w:rFonts w:ascii="Times New Roman" w:hAnsi="Times New Roman"/>
+          <w:sz w:val="28"/>
+        </w:rPr>
+        <w:t>, A.V.Reshetnikov</w:t>
+      </w:r>
+      <w:r>
+        <w:rPr>
+          <w:rFonts w:ascii="Times New Roman" w:hAnsi="Times New Roman"/>
+          <w:sz w:val="28"/>
+          <w:vertAlign w:val="superscript"/>
+        </w:rPr>
+        <w:t>15</w:t>
+      </w:r>
+      <w:r>
+        <w:rPr>
+          <w:rFonts w:ascii="Times New Roman" w:hAnsi="Times New Roman"/>
+          <w:sz w:val="28"/>
+        </w:rPr>
+        <w:t xml:space="preserve"> va boshqalar tomonidan tadqiq qilingan.</w:t>
       </w:r>
     </w:p>
     <w:p>
@@ -147,7 +386,112 @@
           <w:rFonts w:ascii="Times New Roman" w:hAnsi="Times New Roman"/>
           <w:sz w:val="28"/>
         </w:rPr>
-        <w:t>Tashkiliy boshqaruv mexanizmlari va ularning samaradorligini baholash masalalari D.A.Zyukin, S.A.Belyayev, O.S.Nazarmatov, O.S.Ismailova, Elliott Jaques, Robert Simons, Boned-Galán A., López-Ibort N., Gascón-Catalán A., Kaplan va Norton, M.Porter, L.Green kabi olimlar tomonidan o'rganilgan.</w:t>
+        <w:t>Tashkiliy boshqaruv mexanizmlari va ularning samaradorligini baholash masalalari E.Jaques</w:t>
+      </w:r>
+      <w:r>
+        <w:rPr>
+          <w:rFonts w:ascii="Times New Roman" w:hAnsi="Times New Roman"/>
+          <w:sz w:val="28"/>
+          <w:vertAlign w:val="superscript"/>
+        </w:rPr>
+        <w:t>16</w:t>
+      </w:r>
+      <w:r>
+        <w:rPr>
+          <w:rFonts w:ascii="Times New Roman" w:hAnsi="Times New Roman"/>
+          <w:sz w:val="28"/>
+        </w:rPr>
+        <w:t>, R.Simons</w:t>
+      </w:r>
+      <w:r>
+        <w:rPr>
+          <w:rFonts w:ascii="Times New Roman" w:hAnsi="Times New Roman"/>
+          <w:sz w:val="28"/>
+          <w:vertAlign w:val="superscript"/>
+        </w:rPr>
+        <w:t>17</w:t>
+      </w:r>
+      <w:r>
+        <w:rPr>
+          <w:rFonts w:ascii="Times New Roman" w:hAnsi="Times New Roman"/>
+          <w:sz w:val="28"/>
+        </w:rPr>
+        <w:t>, Boned-Galán A., López-Ibort N., Gascón-Catalán A.</w:t>
+      </w:r>
+      <w:r>
+        <w:rPr>
+          <w:rFonts w:ascii="Times New Roman" w:hAnsi="Times New Roman"/>
+          <w:sz w:val="28"/>
+          <w:vertAlign w:val="superscript"/>
+        </w:rPr>
+        <w:t>18</w:t>
+      </w:r>
+      <w:r>
+        <w:rPr>
+          <w:rFonts w:ascii="Times New Roman" w:hAnsi="Times New Roman"/>
+          <w:sz w:val="28"/>
+        </w:rPr>
+        <w:t>, R.Kaplan va D.Norton</w:t>
+      </w:r>
+      <w:r>
+        <w:rPr>
+          <w:rFonts w:ascii="Times New Roman" w:hAnsi="Times New Roman"/>
+          <w:sz w:val="28"/>
+          <w:vertAlign w:val="superscript"/>
+        </w:rPr>
+        <w:t>19</w:t>
+      </w:r>
+      <w:r>
+        <w:rPr>
+          <w:rFonts w:ascii="Times New Roman" w:hAnsi="Times New Roman"/>
+          <w:sz w:val="28"/>
+        </w:rPr>
+        <w:t>, M.Porter</w:t>
+      </w:r>
+      <w:r>
+        <w:rPr>
+          <w:rFonts w:ascii="Times New Roman" w:hAnsi="Times New Roman"/>
+          <w:sz w:val="28"/>
+          <w:vertAlign w:val="superscript"/>
+        </w:rPr>
+        <w:t>20</w:t>
+      </w:r>
+      <w:r>
+        <w:rPr>
+          <w:rFonts w:ascii="Times New Roman" w:hAnsi="Times New Roman"/>
+          <w:sz w:val="28"/>
+        </w:rPr>
+        <w:t>, Y.A.Ozcan</w:t>
+      </w:r>
+      <w:r>
+        <w:rPr>
+          <w:rFonts w:ascii="Times New Roman" w:hAnsi="Times New Roman"/>
+          <w:sz w:val="28"/>
+          <w:vertAlign w:val="superscript"/>
+        </w:rPr>
+        <w:t>21</w:t>
+      </w:r>
+      <w:r>
+        <w:rPr>
+          <w:rFonts w:ascii="Times New Roman" w:hAnsi="Times New Roman"/>
+          <w:sz w:val="28"/>
+        </w:rPr>
+        <w:t>, L.Green</w:t>
+      </w:r>
+      <w:r>
+        <w:rPr>
+          <w:rFonts w:ascii="Times New Roman" w:hAnsi="Times New Roman"/>
+          <w:sz w:val="28"/>
+          <w:vertAlign w:val="superscript"/>
+        </w:rPr>
+        <w:t>22</w:t>
+      </w:r>
+      <w:r>
+        <w:rPr>
+          <w:rFonts w:ascii="Times New Roman" w:hAnsi="Times New Roman"/>
+          <w:sz w:val="28"/>
+        </w:rPr>
+        <w:t xml:space="preserve"> kabi olimlar tomonidan o'rganilgan.</w:t>
       </w:r>
     </w:p>
     <w:p>
@@ -161,7 +505,52 @@
           <w:rFonts w:ascii="Times New Roman" w:hAnsi="Times New Roman"/>
           <w:sz w:val="28"/>
         </w:rPr>
-        <w:t>O'zbekistonlik olimlardan M.Bayzaqov, Y.Allayorov, D.B.Elmurotova, X.M.Mirsaidova va boshqalarning ilmiy ishlarida sog'liqni saqlash tizimida boshqaruv muammolarining ayrim jihatlari yoritilgan. Ammo yuqorida keltirilgan olimlarning asarlarida sog'liqni saqlash muassasalarida boshqarishning tashkiliy mexanizmlarini optimallashtirish masalalari kompleks tadqiqot sifatida yetarli darajada o'rganilmagan. Xususan, tibbiyot muassasalarida boshqaruv masshtabi va buyruqlar zanjirining optimal nisbatini ekonometrik usullar yordamida aniqlash, klinik quvvatdan foydalanish ko'rsatkichini ssenariy asosida prognozlashtirish hamda integratsiyalashgan boshqaruv modellarini ishlab chiqish masalalari alohida ilmiy tadqiqotni taqozo etadi.</w:t>
+        <w:t>O'zbekistonlik olimlardan M.Bayzaqov, Y.Allayorov</w:t>
+      </w:r>
+      <w:r>
+        <w:rPr>
+          <w:rFonts w:ascii="Times New Roman" w:hAnsi="Times New Roman"/>
+          <w:sz w:val="28"/>
+          <w:vertAlign w:val="superscript"/>
+        </w:rPr>
+        <w:t>23</w:t>
+      </w:r>
+      <w:r>
+        <w:rPr>
+          <w:rFonts w:ascii="Times New Roman" w:hAnsi="Times New Roman"/>
+          <w:sz w:val="28"/>
+        </w:rPr>
+        <w:t>, D.B.Elmurotova</w:t>
+      </w:r>
+      <w:r>
+        <w:rPr>
+          <w:rFonts w:ascii="Times New Roman" w:hAnsi="Times New Roman"/>
+          <w:sz w:val="28"/>
+          <w:vertAlign w:val="superscript"/>
+        </w:rPr>
+        <w:t>24</w:t>
+      </w:r>
+      <w:r>
+        <w:rPr>
+          <w:rFonts w:ascii="Times New Roman" w:hAnsi="Times New Roman"/>
+          <w:sz w:val="28"/>
+        </w:rPr>
+        <w:t>, X.M.Mirsaidova</w:t>
+      </w:r>
+      <w:r>
+        <w:rPr>
+          <w:rFonts w:ascii="Times New Roman" w:hAnsi="Times New Roman"/>
+          <w:sz w:val="28"/>
+          <w:vertAlign w:val="superscript"/>
+        </w:rPr>
+        <w:t>25</w:t>
+      </w:r>
+      <w:r>
+        <w:rPr>
+          <w:rFonts w:ascii="Times New Roman" w:hAnsi="Times New Roman"/>
+          <w:sz w:val="28"/>
+        </w:rPr>
+        <w:t xml:space="preserve"> va boshqalarning ilmiy ishlarida sog'liqni saqlash tizimida boshqaruv muammolarining ayrim jihatlari yoritilgan. Ammo yuqorida keltirilgan olimlarning asarlarida sog'liqni saqlash muassasalarida boshqarishning tashkiliy mexanizmlarini optimallashtirish masalalari kompleks tadqiqot sifatida yetarli darajada o'rganilmagan. Xususan, tibbiyot muassasalarida boshqaruv masshtabi va buyruqlar zanjirining optimal nisbatini ekonometrik usullar yordamida aniqlash, klinik quvvatdan foydalanish ko'rsatkichini ssenariy asosida prognozlashtirish hamda integratsiyalashgan boshqaruv modellarini ishlab chiqish masalalari alohida ilmiy tadqiqotni taqozo etadi.</w:t>
       </w:r>
     </w:p>
     <w:p>
@@ -803,6 +1192,545 @@
         <w:t>– "Sog'liqni saqlash muassasalarini boshqarishning tashkiliy mexanizmlarini takomillashtirish yo'llari" – sog'liqni saqlash muassasalarini boshqarishning tashkiliy mexanizmlarini takomillashtirish istiqbollari, tibbiyot muassasalarida zamonaviy boshqaruv tizimini takomillashtirish bo'yicha tavsiyalar hamda Buxoro viloyati tibbiyot muassasalarida klinik quvvatdan foydalanish ko'rsatkichini ssenariy asosida prognozlashtirish va optimallashtirish masalalarini qamrab oladi. Ushbu bobda raqamlashtirish (e-health, EHR, telemeditsina), "Ikki tomonlama iyerarxik boshqaruv" modeli (Dual-Leadership Structure), Integratsiyalashgan amaliyot bo'linmalari (IPU), bemorlar oqimini boshqaruvchi yagona dispetcherlik markazi, DRG asosidagi natijadorlik baholash tizimi, kadrlar tayyorlash va motivatsiya tizimini takomillashtirish kabi amaliy tavsiyalar ishlab chiqilgan. Shuningdek, Buxoro viloyati tibbiyot muassasalari uchun optimistik va pessimistik ssenariylarda 2028-yilgacha prognoz ko'rsatkichlari hisoblab chiqilgan va har bir muassasa uchun differensial tavsiyalar shakllantirilgan.</w:t>
       </w:r>
     </w:p>
+    <w:p/>
+    <w:p/>
+    <w:p>
+      <w:pPr>
+        <w:jc w:val="left"/>
+      </w:pPr>
+      <w:r>
+        <w:rPr>
+          <w:rFonts w:ascii="Times New Roman" w:hAnsi="Times New Roman"/>
+          <w:sz w:val="20"/>
+        </w:rPr>
+        <w:t>________________________________________</w:t>
+      </w:r>
+    </w:p>
+    <w:p>
+      <w:pPr>
+        <w:spacing w:after="40" w:line="240" w:lineRule="auto"/>
+        <w:jc w:val="both"/>
+      </w:pPr>
+      <w:r>
+        <w:rPr>
+          <w:rFonts w:ascii="Times New Roman" w:hAnsi="Times New Roman"/>
+          <w:sz w:val="20"/>
+          <w:vertAlign w:val="superscript"/>
+        </w:rPr>
+        <w:t xml:space="preserve">1 </w:t>
+      </w:r>
+      <w:r>
+        <w:rPr>
+          <w:rFonts w:ascii="Times New Roman" w:hAnsi="Times New Roman"/>
+          <w:sz w:val="20"/>
+        </w:rPr>
+        <w:t>World Health Organization. World Health Report 2010: Health Systems Financing: the Path to Universal Coverage. – Geneva: WHO, 2010.</w:t>
+      </w:r>
+    </w:p>
+    <w:p>
+      <w:pPr>
+        <w:spacing w:after="40" w:line="240" w:lineRule="auto"/>
+        <w:jc w:val="both"/>
+      </w:pPr>
+      <w:r>
+        <w:rPr>
+          <w:rFonts w:ascii="Times New Roman" w:hAnsi="Times New Roman"/>
+          <w:sz w:val="20"/>
+          <w:vertAlign w:val="superscript"/>
+        </w:rPr>
+        <w:t xml:space="preserve">2 </w:t>
+      </w:r>
+      <w:r>
+        <w:rPr>
+          <w:rFonts w:ascii="Times New Roman" w:hAnsi="Times New Roman"/>
+          <w:sz w:val="20"/>
+        </w:rPr>
+        <w:t>Luxon, L. Infrastructure – the key to healthcare improvement // Future Hospital Journal. – 2015. – Vol. 2, No. 1. – P. 4–7.</w:t>
+      </w:r>
+    </w:p>
+    <w:p>
+      <w:pPr>
+        <w:spacing w:after="40" w:line="240" w:lineRule="auto"/>
+        <w:jc w:val="both"/>
+      </w:pPr>
+      <w:r>
+        <w:rPr>
+          <w:rFonts w:ascii="Times New Roman" w:hAnsi="Times New Roman"/>
+          <w:sz w:val="20"/>
+          <w:vertAlign w:val="superscript"/>
+        </w:rPr>
+        <w:t xml:space="preserve">3 </w:t>
+      </w:r>
+      <w:r>
+        <w:rPr>
+          <w:rFonts w:ascii="Times New Roman" w:hAnsi="Times New Roman"/>
+          <w:sz w:val="20"/>
+        </w:rPr>
+        <w:t>O'zbekiston Respublikasi Prezidentining 2018 yil 7 dekabrdagi "O'zbekiston Respublikasi sog'liqni saqlash tizimini tubdan takomillashtirish bo'yicha kompleks chora-tadbirlar to'g'risida"gi PF-5590-sonli Farmoni. https://lex.uz/docs/4096203</w:t>
+      </w:r>
+    </w:p>
+    <w:p>
+      <w:pPr>
+        <w:spacing w:after="40" w:line="240" w:lineRule="auto"/>
+        <w:jc w:val="both"/>
+      </w:pPr>
+      <w:r>
+        <w:rPr>
+          <w:rFonts w:ascii="Times New Roman" w:hAnsi="Times New Roman"/>
+          <w:sz w:val="20"/>
+          <w:vertAlign w:val="superscript"/>
+        </w:rPr>
+        <w:t xml:space="preserve">4 </w:t>
+      </w:r>
+      <w:r>
+        <w:rPr>
+          <w:rFonts w:ascii="Times New Roman" w:hAnsi="Times New Roman"/>
+          <w:sz w:val="20"/>
+        </w:rPr>
+        <w:t>O'zbekiston Respublikasi Prezidentining 2019 yil 13 fevraldagi PQ-4190-sonli "2019–2025-yillarda O'zbekiston Respublikasi aholisining ruhiy salomatligini muhofaza qilish xizmatini rivojlantirish konsepsiyasini tasdiqlash to'g'risida"gi Qarori. https://lex.uz/docs/4200785</w:t>
+      </w:r>
+    </w:p>
+    <w:p>
+      <w:pPr>
+        <w:spacing w:after="40" w:line="240" w:lineRule="auto"/>
+        <w:jc w:val="both"/>
+      </w:pPr>
+      <w:r>
+        <w:rPr>
+          <w:rFonts w:ascii="Times New Roman" w:hAnsi="Times New Roman"/>
+          <w:sz w:val="20"/>
+          <w:vertAlign w:val="superscript"/>
+        </w:rPr>
+        <w:t xml:space="preserve">5 </w:t>
+      </w:r>
+      <w:r>
+        <w:rPr>
+          <w:rFonts w:ascii="Times New Roman" w:hAnsi="Times New Roman"/>
+          <w:sz w:val="20"/>
+        </w:rPr>
+        <w:t>O'zbekiston Respublikasi Prezidentining 2023-yil 6-sentabrdagi "Sog'liqni saqlash vazirligi faoliyatini yanada takomillashtirish chora-tadbirlari to'g'risida"gi PF-156-sonli Farmoni. https://lex.uz/docs/6621420</w:t>
+      </w:r>
+    </w:p>
+    <w:p>
+      <w:pPr>
+        <w:spacing w:after="40" w:line="240" w:lineRule="auto"/>
+        <w:jc w:val="both"/>
+      </w:pPr>
+      <w:r>
+        <w:rPr>
+          <w:rFonts w:ascii="Times New Roman" w:hAnsi="Times New Roman"/>
+          <w:sz w:val="20"/>
+          <w:vertAlign w:val="superscript"/>
+        </w:rPr>
+        <w:t xml:space="preserve">6 </w:t>
+      </w:r>
+      <w:r>
+        <w:rPr>
+          <w:rFonts w:ascii="Times New Roman" w:hAnsi="Times New Roman"/>
+          <w:sz w:val="20"/>
+        </w:rPr>
+        <w:t>O'zbekiston Respublikasi Prezidentining 2025 yil 19 maydagi "Sog'liqni saqlash tizimidagi islohotlarni amalga oshirishning qo'shimcha chora-tadbirlari to'g'risida"gi PQ-185-sonli Qarori.</w:t>
+      </w:r>
+    </w:p>
+    <w:p>
+      <w:pPr>
+        <w:spacing w:after="40" w:line="240" w:lineRule="auto"/>
+        <w:jc w:val="both"/>
+      </w:pPr>
+      <w:r>
+        <w:rPr>
+          <w:rFonts w:ascii="Times New Roman" w:hAnsi="Times New Roman"/>
+          <w:sz w:val="20"/>
+          <w:vertAlign w:val="superscript"/>
+        </w:rPr>
+        <w:t xml:space="preserve">7 </w:t>
+      </w:r>
+      <w:r>
+        <w:rPr>
+          <w:rFonts w:ascii="Times New Roman" w:hAnsi="Times New Roman"/>
+          <w:sz w:val="20"/>
+        </w:rPr>
+        <w:t>O'zbekiston Respublikasi Sog'liqni saqlash vazirining 2026-yil 19-yanvardagi 3758-son buyrug'i "Elektron sog'liqni saqlash tizimini joriy etish to'g'risida".</w:t>
+      </w:r>
+    </w:p>
+    <w:p>
+      <w:pPr>
+        <w:spacing w:after="40" w:line="240" w:lineRule="auto"/>
+        <w:jc w:val="both"/>
+      </w:pPr>
+      <w:r>
+        <w:rPr>
+          <w:rFonts w:ascii="Times New Roman" w:hAnsi="Times New Roman"/>
+          <w:sz w:val="20"/>
+          <w:vertAlign w:val="superscript"/>
+        </w:rPr>
+        <w:t xml:space="preserve">8 </w:t>
+      </w:r>
+      <w:r>
+        <w:rPr>
+          <w:rFonts w:ascii="Times New Roman" w:hAnsi="Times New Roman"/>
+          <w:sz w:val="20"/>
+        </w:rPr>
+        <w:t>Drucker, P.F. Management: Tasks, Responsibilities, Practices. – New York: Harper &amp; Row, 1974. – 839 p.</w:t>
+      </w:r>
+    </w:p>
+    <w:p>
+      <w:pPr>
+        <w:spacing w:after="40" w:line="240" w:lineRule="auto"/>
+        <w:jc w:val="both"/>
+      </w:pPr>
+      <w:r>
+        <w:rPr>
+          <w:rFonts w:ascii="Times New Roman" w:hAnsi="Times New Roman"/>
+          <w:sz w:val="20"/>
+          <w:vertAlign w:val="superscript"/>
+        </w:rPr>
+        <w:t xml:space="preserve">9 </w:t>
+      </w:r>
+      <w:r>
+        <w:rPr>
+          <w:rFonts w:ascii="Times New Roman" w:hAnsi="Times New Roman"/>
+          <w:sz w:val="20"/>
+        </w:rPr>
+        <w:t>Fayol, H. General and Industrial Management / Trans. by C.Storrs. – London: Pitman, 1949. – 110 p.</w:t>
+      </w:r>
+    </w:p>
+    <w:p>
+      <w:pPr>
+        <w:spacing w:after="40" w:line="240" w:lineRule="auto"/>
+        <w:jc w:val="both"/>
+      </w:pPr>
+      <w:r>
+        <w:rPr>
+          <w:rFonts w:ascii="Times New Roman" w:hAnsi="Times New Roman"/>
+          <w:sz w:val="20"/>
+          <w:vertAlign w:val="superscript"/>
+        </w:rPr>
+        <w:t xml:space="preserve">10 </w:t>
+      </w:r>
+      <w:r>
+        <w:rPr>
+          <w:rFonts w:ascii="Times New Roman" w:hAnsi="Times New Roman"/>
+          <w:sz w:val="20"/>
+        </w:rPr>
+        <w:t>Taylor, F.W. The Principles of Scientific Management. – New York: Harper &amp; Brothers, 1911. – 144 p.</w:t>
+      </w:r>
+    </w:p>
+    <w:p>
+      <w:pPr>
+        <w:spacing w:after="40" w:line="240" w:lineRule="auto"/>
+        <w:jc w:val="both"/>
+      </w:pPr>
+      <w:r>
+        <w:rPr>
+          <w:rFonts w:ascii="Times New Roman" w:hAnsi="Times New Roman"/>
+          <w:sz w:val="20"/>
+          <w:vertAlign w:val="superscript"/>
+        </w:rPr>
+        <w:t xml:space="preserve">11 </w:t>
+      </w:r>
+      <w:r>
+        <w:rPr>
+          <w:rFonts w:ascii="Times New Roman" w:hAnsi="Times New Roman"/>
+          <w:sz w:val="20"/>
+        </w:rPr>
+        <w:t>Mayo, E. The Human Problems of an Industrial Civilization. – New York: Macmillan, 1933. – 194 p.</w:t>
+      </w:r>
+    </w:p>
+    <w:p>
+      <w:pPr>
+        <w:spacing w:after="40" w:line="240" w:lineRule="auto"/>
+        <w:jc w:val="both"/>
+      </w:pPr>
+      <w:r>
+        <w:rPr>
+          <w:rFonts w:ascii="Times New Roman" w:hAnsi="Times New Roman"/>
+          <w:sz w:val="20"/>
+          <w:vertAlign w:val="superscript"/>
+        </w:rPr>
+        <w:t xml:space="preserve">12 </w:t>
+      </w:r>
+      <w:r>
+        <w:rPr>
+          <w:rFonts w:ascii="Times New Roman" w:hAnsi="Times New Roman"/>
+          <w:sz w:val="20"/>
+        </w:rPr>
+        <w:t>Медик В.А., Юрьев В.К. Общественное здоровье и здравоохранение: учебник. – М.: ГЭОТАР-Медиа, 2018. – 656 с.</w:t>
+      </w:r>
+    </w:p>
+    <w:p>
+      <w:pPr>
+        <w:spacing w:after="40" w:line="240" w:lineRule="auto"/>
+        <w:jc w:val="both"/>
+      </w:pPr>
+      <w:r>
+        <w:rPr>
+          <w:rFonts w:ascii="Times New Roman" w:hAnsi="Times New Roman"/>
+          <w:sz w:val="20"/>
+          <w:vertAlign w:val="superscript"/>
+        </w:rPr>
+        <w:t xml:space="preserve">13 </w:t>
+      </w:r>
+      <w:r>
+        <w:rPr>
+          <w:rFonts w:ascii="Times New Roman" w:hAnsi="Times New Roman"/>
+          <w:sz w:val="20"/>
+        </w:rPr>
+        <w:t>Столяров С.А. Менеджмент в здравоохранении: учебник. – М.: ГЭОТАР-Медиа, 2017. – 768 с.</w:t>
+      </w:r>
+    </w:p>
+    <w:p>
+      <w:pPr>
+        <w:spacing w:after="40" w:line="240" w:lineRule="auto"/>
+        <w:jc w:val="both"/>
+      </w:pPr>
+      <w:r>
+        <w:rPr>
+          <w:rFonts w:ascii="Times New Roman" w:hAnsi="Times New Roman"/>
+          <w:sz w:val="20"/>
+          <w:vertAlign w:val="superscript"/>
+        </w:rPr>
+        <w:t xml:space="preserve">14 </w:t>
+      </w:r>
+      <w:r>
+        <w:rPr>
+          <w:rFonts w:ascii="Times New Roman" w:hAnsi="Times New Roman"/>
+          <w:sz w:val="20"/>
+        </w:rPr>
+        <w:t>Лисицын Ю.П. Общественное здоровье и здравоохранение: учебник. – М.: ГЭОТАР-Медиа, 2015. – 544 с.</w:t>
+      </w:r>
+    </w:p>
+    <w:p>
+      <w:pPr>
+        <w:spacing w:after="40" w:line="240" w:lineRule="auto"/>
+        <w:jc w:val="both"/>
+      </w:pPr>
+      <w:r>
+        <w:rPr>
+          <w:rFonts w:ascii="Times New Roman" w:hAnsi="Times New Roman"/>
+          <w:sz w:val="20"/>
+          <w:vertAlign w:val="superscript"/>
+        </w:rPr>
+        <w:t xml:space="preserve">15 </w:t>
+      </w:r>
+      <w:r>
+        <w:rPr>
+          <w:rFonts w:ascii="Times New Roman" w:hAnsi="Times New Roman"/>
+          <w:sz w:val="20"/>
+        </w:rPr>
+        <w:t>Решетников А.В., Алексеева В.М., Галкин Е.Б. Экономика здравоохранения: учебное пособие. – М.: ГЭОТАР-Медиа, 2015. – 192 с.</w:t>
+      </w:r>
+    </w:p>
+    <w:p>
+      <w:pPr>
+        <w:spacing w:after="40" w:line="240" w:lineRule="auto"/>
+        <w:jc w:val="both"/>
+      </w:pPr>
+      <w:r>
+        <w:rPr>
+          <w:rFonts w:ascii="Times New Roman" w:hAnsi="Times New Roman"/>
+          <w:sz w:val="20"/>
+          <w:vertAlign w:val="superscript"/>
+        </w:rPr>
+        <w:t xml:space="preserve">16 </w:t>
+      </w:r>
+      <w:r>
+        <w:rPr>
+          <w:rFonts w:ascii="Times New Roman" w:hAnsi="Times New Roman"/>
+          <w:sz w:val="20"/>
+        </w:rPr>
+        <w:t>Jaques, E. Requisite Organization: A Total System for Effective Managerial Organization and Managerial Leadership for the 21st Century. – Arlington: Cason Hall, 1997. – 312 p.</w:t>
+      </w:r>
+    </w:p>
+    <w:p>
+      <w:pPr>
+        <w:spacing w:after="40" w:line="240" w:lineRule="auto"/>
+        <w:jc w:val="both"/>
+      </w:pPr>
+      <w:r>
+        <w:rPr>
+          <w:rFonts w:ascii="Times New Roman" w:hAnsi="Times New Roman"/>
+          <w:sz w:val="20"/>
+          <w:vertAlign w:val="superscript"/>
+        </w:rPr>
+        <w:t xml:space="preserve">17 </w:t>
+      </w:r>
+      <w:r>
+        <w:rPr>
+          <w:rFonts w:ascii="Times New Roman" w:hAnsi="Times New Roman"/>
+          <w:sz w:val="20"/>
+        </w:rPr>
+        <w:t>Simons, R. Levers of Control: How Managers Use Innovative Control Systems to Drive Strategic Renewal. – Boston: Harvard Business School Press, 1995. – 232 p.</w:t>
+      </w:r>
+    </w:p>
+    <w:p>
+      <w:pPr>
+        <w:spacing w:after="40" w:line="240" w:lineRule="auto"/>
+        <w:jc w:val="both"/>
+      </w:pPr>
+      <w:r>
+        <w:rPr>
+          <w:rFonts w:ascii="Times New Roman" w:hAnsi="Times New Roman"/>
+          <w:sz w:val="20"/>
+          <w:vertAlign w:val="superscript"/>
+        </w:rPr>
+        <w:t xml:space="preserve">18 </w:t>
+      </w:r>
+      <w:r>
+        <w:rPr>
+          <w:rFonts w:ascii="Times New Roman" w:hAnsi="Times New Roman"/>
+          <w:sz w:val="20"/>
+        </w:rPr>
+        <w:t>Boned-Galán, A., López-Ibort, N., &amp; Gascón-Catalán, A. Span of control in nursing management: An integrative review // Journal of Nursing Management. – 2023. – Vol. 31. – P. 1–12.</w:t>
+      </w:r>
+    </w:p>
+    <w:p>
+      <w:pPr>
+        <w:spacing w:after="40" w:line="240" w:lineRule="auto"/>
+        <w:jc w:val="both"/>
+      </w:pPr>
+      <w:r>
+        <w:rPr>
+          <w:rFonts w:ascii="Times New Roman" w:hAnsi="Times New Roman"/>
+          <w:sz w:val="20"/>
+          <w:vertAlign w:val="superscript"/>
+        </w:rPr>
+        <w:t xml:space="preserve">19 </w:t>
+      </w:r>
+      <w:r>
+        <w:rPr>
+          <w:rFonts w:ascii="Times New Roman" w:hAnsi="Times New Roman"/>
+          <w:sz w:val="20"/>
+        </w:rPr>
+        <w:t>Kaplan, R.S., Norton, D.P. The Balanced Scorecard: Translating Strategy into Action. – Boston: Harvard Business School Press, 1996. – 322 p.</w:t>
+      </w:r>
+    </w:p>
+    <w:p>
+      <w:pPr>
+        <w:spacing w:after="40" w:line="240" w:lineRule="auto"/>
+        <w:jc w:val="both"/>
+      </w:pPr>
+      <w:r>
+        <w:rPr>
+          <w:rFonts w:ascii="Times New Roman" w:hAnsi="Times New Roman"/>
+          <w:sz w:val="20"/>
+          <w:vertAlign w:val="superscript"/>
+        </w:rPr>
+        <w:t xml:space="preserve">20 </w:t>
+      </w:r>
+      <w:r>
+        <w:rPr>
+          <w:rFonts w:ascii="Times New Roman" w:hAnsi="Times New Roman"/>
+          <w:sz w:val="20"/>
+        </w:rPr>
+        <w:t>Porter, M.E., Lee, T.H. The Strategy That Will Fix Health Care // Harvard Business Review. – 2013. – Vol. 91, No. 10. – P. 50–70.</w:t>
+      </w:r>
+    </w:p>
+    <w:p>
+      <w:pPr>
+        <w:spacing w:after="40" w:line="240" w:lineRule="auto"/>
+        <w:jc w:val="both"/>
+      </w:pPr>
+      <w:r>
+        <w:rPr>
+          <w:rFonts w:ascii="Times New Roman" w:hAnsi="Times New Roman"/>
+          <w:sz w:val="20"/>
+          <w:vertAlign w:val="superscript"/>
+        </w:rPr>
+        <w:t xml:space="preserve">21 </w:t>
+      </w:r>
+      <w:r>
+        <w:rPr>
+          <w:rFonts w:ascii="Times New Roman" w:hAnsi="Times New Roman"/>
+          <w:sz w:val="20"/>
+        </w:rPr>
+        <w:t>Ozcan, Y.A. Analytics and Decision Support in Health Care Operations Management. – 3rd ed. – San Francisco: Jossey-Bass, 2017. – 480 p.</w:t>
+      </w:r>
+    </w:p>
+    <w:p>
+      <w:pPr>
+        <w:spacing w:after="40" w:line="240" w:lineRule="auto"/>
+        <w:jc w:val="both"/>
+      </w:pPr>
+      <w:r>
+        <w:rPr>
+          <w:rFonts w:ascii="Times New Roman" w:hAnsi="Times New Roman"/>
+          <w:sz w:val="20"/>
+          <w:vertAlign w:val="superscript"/>
+        </w:rPr>
+        <w:t xml:space="preserve">22 </w:t>
+      </w:r>
+      <w:r>
+        <w:rPr>
+          <w:rFonts w:ascii="Times New Roman" w:hAnsi="Times New Roman"/>
+          <w:sz w:val="20"/>
+        </w:rPr>
+        <w:t>Green, L.V. Capacity Planning and Management in Hospitals // Operations Research and Health Care. – 2005. – P. 15–41.</w:t>
+      </w:r>
+    </w:p>
+    <w:p>
+      <w:pPr>
+        <w:spacing w:after="40" w:line="240" w:lineRule="auto"/>
+        <w:jc w:val="both"/>
+      </w:pPr>
+      <w:r>
+        <w:rPr>
+          <w:rFonts w:ascii="Times New Roman" w:hAnsi="Times New Roman"/>
+          <w:sz w:val="20"/>
+          <w:vertAlign w:val="superscript"/>
+        </w:rPr>
+        <w:t xml:space="preserve">23 </w:t>
+      </w:r>
+      <w:r>
+        <w:rPr>
+          <w:rFonts w:ascii="Times New Roman" w:hAnsi="Times New Roman"/>
+          <w:sz w:val="20"/>
+        </w:rPr>
+        <w:t>Bayzaqov M., Allayorov Y. Tibbiyotda menejment va marketing: darslik. – T.: Ibn Sino nashriyoti, 2005. – 240 b.</w:t>
+      </w:r>
+    </w:p>
+    <w:p>
+      <w:pPr>
+        <w:spacing w:after="40" w:line="240" w:lineRule="auto"/>
+        <w:jc w:val="both"/>
+      </w:pPr>
+      <w:r>
+        <w:rPr>
+          <w:rFonts w:ascii="Times New Roman" w:hAnsi="Times New Roman"/>
+          <w:sz w:val="20"/>
+          <w:vertAlign w:val="superscript"/>
+        </w:rPr>
+        <w:t xml:space="preserve">24 </w:t>
+      </w:r>
+      <w:r>
+        <w:rPr>
+          <w:rFonts w:ascii="Times New Roman" w:hAnsi="Times New Roman"/>
+          <w:sz w:val="20"/>
+        </w:rPr>
+        <w:t>Elmurotova D.B. Sog'liqni saqlash tizimida boshqaruv: o'quv qo'llanma. – T.: 2020.</w:t>
+      </w:r>
+    </w:p>
+    <w:p>
+      <w:pPr>
+        <w:spacing w:after="40" w:line="240" w:lineRule="auto"/>
+        <w:jc w:val="both"/>
+      </w:pPr>
+      <w:r>
+        <w:rPr>
+          <w:rFonts w:ascii="Times New Roman" w:hAnsi="Times New Roman"/>
+          <w:sz w:val="20"/>
+          <w:vertAlign w:val="superscript"/>
+        </w:rPr>
+        <w:t xml:space="preserve">25 </w:t>
+      </w:r>
+      <w:r>
+        <w:rPr>
+          <w:rFonts w:ascii="Times New Roman" w:hAnsi="Times New Roman"/>
+          <w:sz w:val="20"/>
+        </w:rPr>
+        <w:t>Mirsaidova X.M. Sog'liqni saqlash sohasida tadbirkorlikning rivojlanishi va kadrlar boshqaruvi // Iqtisodiyot va ta'lim. – 2019. – №3. – B. 45–52.</w:t>
+      </w:r>
+    </w:p>
     <w:sectPr>
       <w:pgSz w:w="12240" w:h="15840"/>
       <w:pgMar w:top="1134" w:right="850" w:bottom="1134" w:left="1701" w:header="720" w:footer="720" w:gutter="0"/>

</xml_diff>